<commit_message>
Client sample: use a real synthesis verdict token so the badge renders
The Netherlands demonstration mock used a free Arabic verdict string
("دخول مشروط") which _verdict_tone cannot classify (it keys off
synthesis tokens GO/WATCH/CONDITIONAL/NO-GO), so the cover badge showed
"تعذّر إصدار توصية". Real runs always carry a token. Switched the mock
to "CONDITIONAL-GO" so the sample demonstrates the correct client badge
("مراقبة السوق"). Regenerated samples/client_report_latest.docx.
</commit_message>
<xml_diff>
--- a/samples/client_report_latest.docx
+++ b/samples/client_report_latest.docx
@@ -36,10 +36,11 @@
       <w:r>
         <w:rPr>
           <w:b/>
-          <w:color w:val="606060"/>
+          <w:color w:val="000000"/>
           <w:sz w:val="32"/>
+          <w:highlight w:val="yellow"/>
         </w:rPr>
-        <w:t xml:space="preserve">  تعذّر إصدار توصية  </w:t>
+        <w:t xml:space="preserve">  مراقبة السوق  </w:t>
       </w:r>
     </w:p>
     <w:tbl>
@@ -209,7 +210,7 @@
     </w:p>
     <w:p>
       <w:r>
-        <w:t>التوصية: تعذّر إصدار توصية</w:t>
+        <w:t>التوصية: مراقبة السوق</w:t>
       </w:r>
     </w:p>
     <w:p>
@@ -1471,19 +1472,6 @@
     </w:p>
     <w:p>
       <w:pPr>
-        <w:pStyle w:val="Heading2"/>
-      </w:pPr>
-      <w:r>
-        <w:t>الخطوة التالية المقترحة</w:t>
-      </w:r>
-    </w:p>
-    <w:p>
-      <w:r>
-        <w:t>فعّل خدمة التعميق المدفوعة للتحقق من المستوردين وجهات الاتصال (Volza/Explee)</w:t>
-      </w:r>
-    </w:p>
-    <w:p>
-      <w:pPr>
         <w:pStyle w:val="Heading1"/>
       </w:pPr>
       <w:r>

</xml_diff>

<commit_message>
Vendor-name leak fix (client surfaces) + auto/backfill lead enrichment (#118)
ITEM 1 — internal vendor names (Volza/Explee/إكسبلي/فولزا/Serper/SerpApi/LocalPrice/pytrends/GDELT) never reach client surfaces: generic next_step, three-layer client-export defense (sanitize + redact + fail-loud guard, Latin+Arabic), LESSONS row 18 + registry guard, canonical+UK sweep proves zero hits.

ITEM 2 — automatic importer-lead enrichment (phone/email/website) runs as a bounded, Claude-free pipeline stage before the writer when the scraper is set; declared gap on failure, run never stalls. Backfill-only endpoint + UI button for pre-scraper stored reports.

Full hermetic suite green (1186 passed); required e2e-live-shape green.
</commit_message>
<xml_diff>
--- a/samples/client_report_latest.docx
+++ b/samples/client_report_latest.docx
@@ -323,7 +323,7 @@
                 <w:rFonts w:ascii="Arial" w:hAnsi="Arial" w:cs="Arial"/>
                 <w:rtl/>
               </w:rPr>
-              <w:t>2026-07-16</w:t>
+              <w:t>2026-07-17</w:t>
             </w:r>
           </w:p>
         </w:tc>
@@ -3614,7 +3614,7 @@
           <w:rFonts w:ascii="Arial" w:hAnsi="Arial" w:cs="Arial"/>
           <w:rtl/>
         </w:rPr>
-        <w:t>أخبار مخاطر قطاعية جوهرية خلال 12 شهراً (GDELT). وبذلك لا تبرز مخاطرة</w:t>
+        <w:t>أخبار مخاطر قطاعية جوهرية خلال 12 شهراً (خدمة التحقق المدفوعة من المشترين وجهات الاتصال). وبذلك لا تبرز مخاطرة</w:t>
       </w:r>
     </w:p>
     <w:p>
@@ -3908,7 +3908,7 @@
           <w:rFonts w:ascii="Arial" w:hAnsi="Arial" w:cs="Arial"/>
           <w:rtl/>
         </w:rPr>
-        <w:t>اعتمد هذا التقرير على مصادر رسمية عامة (Albert Heijn، EU 2017/625، Eurostat، GDELT، Google Trends، Jumbo)، مع تحليل تقاطعي بينها ومراجعة للاتساق قبل الاعتماد. خضعت كل معلومة للتحقّق من مصدرها العمومي المباشر. أحدث تاريخ جمع بيانات: 2026-07-02. تفاصيل كل رقم بمصدره وتاريخه في «سجل الأدلة للمدققين» ختام التقرير.</w:t>
+        <w:t>اعتمد هذا التقرير على مصادر رسمية عامة (Albert Heijn، EU 2017/625، Eurostat، Google Trends، Jumbo، UN Comtrade)، مع تحليل تقاطعي بينها ومراجعة للاتساق قبل الاعتماد. خضعت كل معلومة للتحقّق من مصدرها العمومي المباشر. أحدث تاريخ جمع بيانات: 2026-07-02. تفاصيل كل رقم بمصدره وتاريخه في «سجل الأدلة للمدققين» ختام التقرير.</w:t>
       </w:r>
     </w:p>
     <w:p>
@@ -4756,7 +4756,7 @@
                 <w:rFonts w:ascii="Arial" w:hAnsi="Arial" w:cs="Arial"/>
                 <w:rtl/>
               </w:rPr>
-              <w:t>GDELT</w:t>
+              <w:t>سجلّات رسمية</w:t>
             </w:r>
           </w:p>
         </w:tc>

</xml_diff>

<commit_message>
Regenerate client_report_latest.docx sample (rule §10.6)
tools/gen_client_report_sample.py exercises render_client_docx(), which
this PR's verdict-consistency gate now also runs through — missed in the
initial sample regeneration pass alongside report_full_latest/
research_report_latest.

Co-Authored-By: Claude Sonnet 5 <noreply@anthropic.com>
Claude-Session: https://claude.ai/code/session_01NeoVJCLMv5mNH7DhYJzdvE
</commit_message>
<xml_diff>
--- a/samples/client_report_latest.docx
+++ b/samples/client_report_latest.docx
@@ -403,7 +403,7 @@
                 <w:rFonts w:ascii="IBM Plex Sans Arabic" w:hAnsi="IBM Plex Sans Arabic" w:cs="IBM Plex Sans Arabic"/>
                 <w:rtl/>
               </w:rPr>
-              <w:t>2026-07-20</w:t>
+              <w:t>2026-07-22</w:t>
             </w:r>
           </w:p>
         </w:tc>
@@ -2018,7 +2018,7 @@
                 <w:color w:val="FFFFFF"/>
                 <w:rtl/>
               </w:rPr>
-              <w:t>السعر/كجم بالدولار</w:t>
+              <w:t>السعر/كجم باليورو</w:t>
             </w:r>
           </w:p>
         </w:tc>

</xml_diff>